<commit_message>
Fix: restore original colors and heading styles
- Use built-in Word Heading 1/2/3 styles with theme blue colors:
  * Problem headings: Heading 1 (dark blue #365F91, 14pt bold)
  * Given/Required/Solution: Heading 2 (blue #4F81BD, 12pt bold)
  * Sub-headings: Heading 3 (blue #4F81BD, 11pt bold)
- Given tables: light blue header shading (#DBE5F1) with blue bottom border
- Summary table: blue header row (#4F81BD) with white text, alternating row shading
- All table borders use blue accent color (#4F81BD)
- Maintains all OMML equations from previous commit
</commit_message>
<xml_diff>
--- a/ProblemSet3-SolutionKey.docx
+++ b/ProblemSet3-SolutionKey.docx
@@ -4,14 +4,10 @@
   <w:body>
     <w:p>
       <w:pPr>
+        <w:pStyle w:val="Heading1"/>
         <w:spacing w:before="360" w:after="120" w:line="240" w:lineRule="auto"/>
       </w:pPr>
       <w:r>
-        <w:rPr>
-          <w:rFonts w:ascii="Calibri" w:hAnsi="Calibri"/>
-          <w:b/>
-          <w:sz w:val="28"/>
-        </w:rPr>
         <w:t>Problem 1</w:t>
       </w:r>
     </w:p>
@@ -30,13 +26,12 @@
     </w:p>
     <w:p>
       <w:pPr>
+        <w:pStyle w:val="Heading2"/>
         <w:spacing w:before="200" w:after="80" w:line="240" w:lineRule="auto"/>
       </w:pPr>
       <w:r>
         <w:rPr>
-          <w:rFonts w:ascii="Calibri" w:hAnsi="Calibri"/>
-          <w:b/>
-          <w:sz w:val="22"/>
+          <w:sz w:val="24"/>
         </w:rPr>
         <w:t>Given</w:t>
       </w:r>
@@ -103,13 +98,12 @@
     </w:p>
     <w:p>
       <w:pPr>
+        <w:pStyle w:val="Heading2"/>
         <w:spacing w:before="200" w:after="80" w:line="240" w:lineRule="auto"/>
       </w:pPr>
       <w:r>
         <w:rPr>
-          <w:rFonts w:ascii="Calibri" w:hAnsi="Calibri"/>
-          <w:b/>
-          <w:sz w:val="22"/>
+          <w:sz w:val="24"/>
         </w:rPr>
         <w:t>Required</w:t>
       </w:r>
@@ -146,26 +140,24 @@
     </w:p>
     <w:p>
       <w:pPr>
+        <w:pStyle w:val="Heading2"/>
         <w:spacing w:before="200" w:after="80" w:line="240" w:lineRule="auto"/>
       </w:pPr>
       <w:r>
         <w:rPr>
-          <w:rFonts w:ascii="Calibri" w:hAnsi="Calibri"/>
-          <w:b/>
-          <w:sz w:val="22"/>
+          <w:sz w:val="24"/>
         </w:rPr>
         <w:t>Solution</w:t>
       </w:r>
     </w:p>
     <w:p>
       <w:pPr>
+        <w:pStyle w:val="Heading3"/>
         <w:ind w:left="357"/>
         <w:spacing w:before="160" w:after="60" w:line="240" w:lineRule="auto"/>
       </w:pPr>
       <w:r>
         <w:rPr>
-          <w:rFonts w:ascii="Calibri" w:hAnsi="Calibri"/>
-          <w:b/>
           <w:sz w:val="22"/>
         </w:rPr>
         <w:t>(a) Finding acceleration</w:t>
@@ -1202,13 +1194,12 @@
     </w:p>
     <w:p>
       <w:pPr>
+        <w:pStyle w:val="Heading3"/>
         <w:ind w:left="357"/>
         <w:spacing w:before="160" w:after="60" w:line="240" w:lineRule="auto"/>
       </w:pPr>
       <w:r>
         <w:rPr>
-          <w:rFonts w:ascii="Calibri" w:hAnsi="Calibri"/>
-          <w:b/>
           <w:sz w:val="22"/>
         </w:rPr>
         <w:t>(b) Finding distance traveled</w:t>
@@ -2239,14 +2230,10 @@
     </w:tbl>
     <w:p>
       <w:pPr>
+        <w:pStyle w:val="Heading1"/>
         <w:spacing w:before="360" w:after="120" w:line="240" w:lineRule="auto"/>
       </w:pPr>
       <w:r>
-        <w:rPr>
-          <w:rFonts w:ascii="Calibri" w:hAnsi="Calibri"/>
-          <w:b/>
-          <w:sz w:val="28"/>
-        </w:rPr>
         <w:t>Problem 2</w:t>
       </w:r>
     </w:p>
@@ -2265,13 +2252,12 @@
     </w:p>
     <w:p>
       <w:pPr>
+        <w:pStyle w:val="Heading2"/>
         <w:spacing w:before="200" w:after="80" w:line="240" w:lineRule="auto"/>
       </w:pPr>
       <w:r>
         <w:rPr>
-          <w:rFonts w:ascii="Calibri" w:hAnsi="Calibri"/>
-          <w:b/>
-          <w:sz w:val="22"/>
+          <w:sz w:val="24"/>
         </w:rPr>
         <w:t>Given</w:t>
       </w:r>
@@ -2313,6 +2299,13 @@
               <w:start w:w="72" w:type="dxa"/>
               <w:end w:w="72" w:type="dxa"/>
             </w:tcMar>
+            <w:tcBorders>
+              <w:top w:val="nil"/>
+              <w:left w:val="nil"/>
+              <w:bottom w:val="single" w:sz="4" w:space="0" w:color="4F81BD"/>
+              <w:right w:val="nil"/>
+            </w:tcBorders>
+            <w:shd w:fill="DBE5F1" w:val="clear" w:color="auto"/>
           </w:tcPr>
           <w:p>
             <w:pPr>
@@ -2322,6 +2315,7 @@
               <w:rPr>
                 <w:rFonts w:ascii="Calibri" w:hAnsi="Calibri"/>
                 <w:b/>
+                <w:color w:val="365F91"/>
                 <w:sz w:val="22"/>
               </w:rPr>
               <w:t>Symbol</w:t>
@@ -2344,6 +2338,13 @@
               <w:start w:w="72" w:type="dxa"/>
               <w:end w:w="72" w:type="dxa"/>
             </w:tcMar>
+            <w:tcBorders>
+              <w:top w:val="nil"/>
+              <w:left w:val="nil"/>
+              <w:bottom w:val="single" w:sz="4" w:space="0" w:color="4F81BD"/>
+              <w:right w:val="nil"/>
+            </w:tcBorders>
+            <w:shd w:fill="DBE5F1" w:val="clear" w:color="auto"/>
           </w:tcPr>
           <w:p>
             <w:pPr>
@@ -2353,6 +2354,7 @@
               <w:rPr>
                 <w:rFonts w:ascii="Calibri" w:hAnsi="Calibri"/>
                 <w:b/>
+                <w:color w:val="365F91"/>
                 <w:sz w:val="22"/>
               </w:rPr>
               <w:t>Value</w:t>
@@ -2375,6 +2377,13 @@
               <w:start w:w="72" w:type="dxa"/>
               <w:end w:w="72" w:type="dxa"/>
             </w:tcMar>
+            <w:tcBorders>
+              <w:top w:val="nil"/>
+              <w:left w:val="nil"/>
+              <w:bottom w:val="single" w:sz="4" w:space="0" w:color="4F81BD"/>
+              <w:right w:val="nil"/>
+            </w:tcBorders>
+            <w:shd w:fill="DBE5F1" w:val="clear" w:color="auto"/>
           </w:tcPr>
           <w:p>
             <w:pPr>
@@ -2384,6 +2393,7 @@
               <w:rPr>
                 <w:rFonts w:ascii="Calibri" w:hAnsi="Calibri"/>
                 <w:b/>
+                <w:color w:val="365F91"/>
                 <w:sz w:val="22"/>
               </w:rPr>
               <w:t>Annotation</w:t>
@@ -2673,13 +2683,12 @@
     </w:tbl>
     <w:p>
       <w:pPr>
+        <w:pStyle w:val="Heading2"/>
         <w:spacing w:before="200" w:after="80" w:line="240" w:lineRule="auto"/>
       </w:pPr>
       <w:r>
         <w:rPr>
-          <w:rFonts w:ascii="Calibri" w:hAnsi="Calibri"/>
-          <w:b/>
-          <w:sz w:val="22"/>
+          <w:sz w:val="24"/>
         </w:rPr>
         <w:t>Required</w:t>
       </w:r>
@@ -2716,26 +2725,24 @@
     </w:p>
     <w:p>
       <w:pPr>
+        <w:pStyle w:val="Heading2"/>
         <w:spacing w:before="200" w:after="80" w:line="240" w:lineRule="auto"/>
       </w:pPr>
       <w:r>
         <w:rPr>
-          <w:rFonts w:ascii="Calibri" w:hAnsi="Calibri"/>
-          <w:b/>
-          <w:sz w:val="22"/>
+          <w:sz w:val="24"/>
         </w:rPr>
         <w:t>Solution</w:t>
       </w:r>
     </w:p>
     <w:p>
       <w:pPr>
+        <w:pStyle w:val="Heading3"/>
         <w:ind w:left="357"/>
         <w:spacing w:before="160" w:after="60" w:line="240" w:lineRule="auto"/>
       </w:pPr>
       <w:r>
         <w:rPr>
-          <w:rFonts w:ascii="Calibri" w:hAnsi="Calibri"/>
-          <w:b/>
           <w:sz w:val="22"/>
         </w:rPr>
         <w:t>(a) Finding acceleration</w:t>
@@ -4286,13 +4293,12 @@
     </w:tbl>
     <w:p>
       <w:pPr>
+        <w:pStyle w:val="Heading3"/>
         <w:ind w:left="357"/>
         <w:spacing w:before="160" w:after="60" w:line="240" w:lineRule="auto"/>
       </w:pPr>
       <w:r>
         <w:rPr>
-          <w:rFonts w:ascii="Calibri" w:hAnsi="Calibri"/>
-          <w:b/>
           <w:sz w:val="22"/>
         </w:rPr>
         <w:t>(b) Finding time</w:t>
@@ -5809,14 +5815,10 @@
     </w:tbl>
     <w:p>
       <w:pPr>
+        <w:pStyle w:val="Heading1"/>
         <w:spacing w:before="360" w:after="120" w:line="240" w:lineRule="auto"/>
       </w:pPr>
       <w:r>
-        <w:rPr>
-          <w:rFonts w:ascii="Calibri" w:hAnsi="Calibri"/>
-          <w:b/>
-          <w:sz w:val="28"/>
-        </w:rPr>
         <w:t>Problem 3</w:t>
       </w:r>
     </w:p>
@@ -5835,13 +5837,12 @@
     </w:p>
     <w:p>
       <w:pPr>
+        <w:pStyle w:val="Heading2"/>
         <w:spacing w:before="200" w:after="80" w:line="240" w:lineRule="auto"/>
       </w:pPr>
       <w:r>
         <w:rPr>
-          <w:rFonts w:ascii="Calibri" w:hAnsi="Calibri"/>
-          <w:b/>
-          <w:sz w:val="22"/>
+          <w:sz w:val="24"/>
         </w:rPr>
         <w:t>Given</w:t>
       </w:r>
@@ -5883,6 +5884,13 @@
               <w:start w:w="72" w:type="dxa"/>
               <w:end w:w="72" w:type="dxa"/>
             </w:tcMar>
+            <w:tcBorders>
+              <w:top w:val="nil"/>
+              <w:left w:val="nil"/>
+              <w:bottom w:val="single" w:sz="4" w:space="0" w:color="4F81BD"/>
+              <w:right w:val="nil"/>
+            </w:tcBorders>
+            <w:shd w:fill="DBE5F1" w:val="clear" w:color="auto"/>
           </w:tcPr>
           <w:p>
             <w:pPr>
@@ -5892,6 +5900,7 @@
               <w:rPr>
                 <w:rFonts w:ascii="Calibri" w:hAnsi="Calibri"/>
                 <w:b/>
+                <w:color w:val="365F91"/>
                 <w:sz w:val="22"/>
               </w:rPr>
               <w:t>Symbol</w:t>
@@ -5914,6 +5923,13 @@
               <w:start w:w="72" w:type="dxa"/>
               <w:end w:w="72" w:type="dxa"/>
             </w:tcMar>
+            <w:tcBorders>
+              <w:top w:val="nil"/>
+              <w:left w:val="nil"/>
+              <w:bottom w:val="single" w:sz="4" w:space="0" w:color="4F81BD"/>
+              <w:right w:val="nil"/>
+            </w:tcBorders>
+            <w:shd w:fill="DBE5F1" w:val="clear" w:color="auto"/>
           </w:tcPr>
           <w:p>
             <w:pPr>
@@ -5923,6 +5939,7 @@
               <w:rPr>
                 <w:rFonts w:ascii="Calibri" w:hAnsi="Calibri"/>
                 <w:b/>
+                <w:color w:val="365F91"/>
                 <w:sz w:val="22"/>
               </w:rPr>
               <w:t>Value</w:t>
@@ -5945,6 +5962,13 @@
               <w:start w:w="72" w:type="dxa"/>
               <w:end w:w="72" w:type="dxa"/>
             </w:tcMar>
+            <w:tcBorders>
+              <w:top w:val="nil"/>
+              <w:left w:val="nil"/>
+              <w:bottom w:val="single" w:sz="4" w:space="0" w:color="4F81BD"/>
+              <w:right w:val="nil"/>
+            </w:tcBorders>
+            <w:shd w:fill="DBE5F1" w:val="clear" w:color="auto"/>
           </w:tcPr>
           <w:p>
             <w:pPr>
@@ -5954,6 +5978,7 @@
               <w:rPr>
                 <w:rFonts w:ascii="Calibri" w:hAnsi="Calibri"/>
                 <w:b/>
+                <w:color w:val="365F91"/>
                 <w:sz w:val="22"/>
               </w:rPr>
               <w:t>Annotation</w:t>
@@ -6273,13 +6298,12 @@
     </w:p>
     <w:p>
       <w:pPr>
+        <w:pStyle w:val="Heading2"/>
         <w:spacing w:before="200" w:after="80" w:line="240" w:lineRule="auto"/>
       </w:pPr>
       <w:r>
         <w:rPr>
-          <w:rFonts w:ascii="Calibri" w:hAnsi="Calibri"/>
-          <w:b/>
-          <w:sz w:val="22"/>
+          <w:sz w:val="24"/>
         </w:rPr>
         <w:t>Required</w:t>
       </w:r>
@@ -6301,13 +6325,12 @@
     </w:p>
     <w:p>
       <w:pPr>
+        <w:pStyle w:val="Heading2"/>
         <w:spacing w:before="200" w:after="80" w:line="240" w:lineRule="auto"/>
       </w:pPr>
       <w:r>
         <w:rPr>
-          <w:rFonts w:ascii="Calibri" w:hAnsi="Calibri"/>
-          <w:b/>
-          <w:sz w:val="22"/>
+          <w:sz w:val="24"/>
         </w:rPr>
         <w:t>Solution</w:t>
       </w:r>
@@ -7968,14 +7991,10 @@
     </w:p>
     <w:p>
       <w:pPr>
+        <w:pStyle w:val="Heading1"/>
         <w:spacing w:before="360" w:after="120" w:line="240" w:lineRule="auto"/>
       </w:pPr>
       <w:r>
-        <w:rPr>
-          <w:rFonts w:ascii="Calibri" w:hAnsi="Calibri"/>
-          <w:b/>
-          <w:sz w:val="28"/>
-        </w:rPr>
         <w:t>Problem 4</w:t>
       </w:r>
     </w:p>
@@ -8009,13 +8028,12 @@
     </w:p>
     <w:p>
       <w:pPr>
+        <w:pStyle w:val="Heading2"/>
         <w:spacing w:before="200" w:after="80" w:line="240" w:lineRule="auto"/>
       </w:pPr>
       <w:r>
         <w:rPr>
-          <w:rFonts w:ascii="Calibri" w:hAnsi="Calibri"/>
-          <w:b/>
-          <w:sz w:val="22"/>
+          <w:sz w:val="24"/>
         </w:rPr>
         <w:t>Given</w:t>
       </w:r>
@@ -8057,6 +8075,13 @@
               <w:start w:w="72" w:type="dxa"/>
               <w:end w:w="72" w:type="dxa"/>
             </w:tcMar>
+            <w:tcBorders>
+              <w:top w:val="nil"/>
+              <w:left w:val="nil"/>
+              <w:bottom w:val="single" w:sz="4" w:space="0" w:color="4F81BD"/>
+              <w:right w:val="nil"/>
+            </w:tcBorders>
+            <w:shd w:fill="DBE5F1" w:val="clear" w:color="auto"/>
           </w:tcPr>
           <w:p>
             <w:pPr>
@@ -8066,6 +8091,7 @@
               <w:rPr>
                 <w:rFonts w:ascii="Calibri" w:hAnsi="Calibri"/>
                 <w:b/>
+                <w:color w:val="365F91"/>
                 <w:sz w:val="22"/>
               </w:rPr>
               <w:t>Symbol</w:t>
@@ -8088,6 +8114,13 @@
               <w:start w:w="72" w:type="dxa"/>
               <w:end w:w="72" w:type="dxa"/>
             </w:tcMar>
+            <w:tcBorders>
+              <w:top w:val="nil"/>
+              <w:left w:val="nil"/>
+              <w:bottom w:val="single" w:sz="4" w:space="0" w:color="4F81BD"/>
+              <w:right w:val="nil"/>
+            </w:tcBorders>
+            <w:shd w:fill="DBE5F1" w:val="clear" w:color="auto"/>
           </w:tcPr>
           <w:p>
             <w:pPr>
@@ -8097,6 +8130,7 @@
               <w:rPr>
                 <w:rFonts w:ascii="Calibri" w:hAnsi="Calibri"/>
                 <w:b/>
+                <w:color w:val="365F91"/>
                 <w:sz w:val="22"/>
               </w:rPr>
               <w:t>Value</w:t>
@@ -8119,6 +8153,13 @@
               <w:start w:w="72" w:type="dxa"/>
               <w:end w:w="72" w:type="dxa"/>
             </w:tcMar>
+            <w:tcBorders>
+              <w:top w:val="nil"/>
+              <w:left w:val="nil"/>
+              <w:bottom w:val="single" w:sz="4" w:space="0" w:color="4F81BD"/>
+              <w:right w:val="nil"/>
+            </w:tcBorders>
+            <w:shd w:fill="DBE5F1" w:val="clear" w:color="auto"/>
           </w:tcPr>
           <w:p>
             <w:pPr>
@@ -8128,6 +8169,7 @@
               <w:rPr>
                 <w:rFonts w:ascii="Calibri" w:hAnsi="Calibri"/>
                 <w:b/>
+                <w:color w:val="365F91"/>
                 <w:sz w:val="22"/>
               </w:rPr>
               <w:t>Annotation</w:t>
@@ -8510,13 +8552,12 @@
     </w:tbl>
     <w:p>
       <w:pPr>
+        <w:pStyle w:val="Heading2"/>
         <w:spacing w:before="200" w:after="80" w:line="240" w:lineRule="auto"/>
       </w:pPr>
       <w:r>
         <w:rPr>
-          <w:rFonts w:ascii="Calibri" w:hAnsi="Calibri"/>
-          <w:b/>
-          <w:sz w:val="22"/>
+          <w:sz w:val="24"/>
         </w:rPr>
         <w:t>Required</w:t>
       </w:r>
@@ -8538,26 +8579,24 @@
     </w:p>
     <w:p>
       <w:pPr>
+        <w:pStyle w:val="Heading2"/>
         <w:spacing w:before="200" w:after="80" w:line="240" w:lineRule="auto"/>
       </w:pPr>
       <w:r>
         <w:rPr>
-          <w:rFonts w:ascii="Calibri" w:hAnsi="Calibri"/>
-          <w:b/>
-          <w:sz w:val="22"/>
+          <w:sz w:val="24"/>
         </w:rPr>
         <w:t>Solution</w:t>
       </w:r>
     </w:p>
     <w:p>
       <w:pPr>
+        <w:pStyle w:val="Heading3"/>
         <w:ind w:left="357"/>
         <w:spacing w:before="160" w:after="60" w:line="240" w:lineRule="auto"/>
       </w:pPr>
       <w:r>
         <w:rPr>
-          <w:rFonts w:ascii="Calibri" w:hAnsi="Calibri"/>
-          <w:b/>
           <w:sz w:val="22"/>
         </w:rPr>
         <w:t>Stage 1 — find the acceleration using the full 6.80 m trip</w:t>
@@ -10192,13 +10231,12 @@
     </w:tbl>
     <w:p>
       <w:pPr>
+        <w:pStyle w:val="Heading3"/>
         <w:ind w:left="357"/>
         <w:spacing w:before="160" w:after="60" w:line="240" w:lineRule="auto"/>
       </w:pPr>
       <w:r>
         <w:rPr>
-          <w:rFonts w:ascii="Calibri" w:hAnsi="Calibri"/>
-          <w:b/>
           <w:sz w:val="22"/>
         </w:rPr>
         <w:t>Stage 2 — use this acceleration to find the speed at 3.40 m</w:t>
@@ -11169,14 +11207,10 @@
     </w:p>
     <w:p>
       <w:pPr>
+        <w:pStyle w:val="Heading1"/>
         <w:spacing w:before="360" w:after="120" w:line="240" w:lineRule="auto"/>
       </w:pPr>
       <w:r>
-        <w:rPr>
-          <w:rFonts w:ascii="Calibri" w:hAnsi="Calibri"/>
-          <w:b/>
-          <w:sz w:val="28"/>
-        </w:rPr>
         <w:t>Problem 5</w:t>
       </w:r>
     </w:p>
@@ -11195,13 +11229,12 @@
     </w:p>
     <w:p>
       <w:pPr>
+        <w:pStyle w:val="Heading2"/>
         <w:spacing w:before="200" w:after="80" w:line="240" w:lineRule="auto"/>
       </w:pPr>
       <w:r>
         <w:rPr>
-          <w:rFonts w:ascii="Calibri" w:hAnsi="Calibri"/>
-          <w:b/>
-          <w:sz w:val="22"/>
+          <w:sz w:val="24"/>
         </w:rPr>
         <w:t>Given</w:t>
       </w:r>
@@ -11243,6 +11276,13 @@
               <w:start w:w="72" w:type="dxa"/>
               <w:end w:w="72" w:type="dxa"/>
             </w:tcMar>
+            <w:tcBorders>
+              <w:top w:val="nil"/>
+              <w:left w:val="nil"/>
+              <w:bottom w:val="single" w:sz="4" w:space="0" w:color="4F81BD"/>
+              <w:right w:val="nil"/>
+            </w:tcBorders>
+            <w:shd w:fill="DBE5F1" w:val="clear" w:color="auto"/>
           </w:tcPr>
           <w:p>
             <w:pPr>
@@ -11252,6 +11292,7 @@
               <w:rPr>
                 <w:rFonts w:ascii="Calibri" w:hAnsi="Calibri"/>
                 <w:b/>
+                <w:color w:val="365F91"/>
                 <w:sz w:val="22"/>
               </w:rPr>
               <w:t>Symbol</w:t>
@@ -11274,6 +11315,13 @@
               <w:start w:w="72" w:type="dxa"/>
               <w:end w:w="72" w:type="dxa"/>
             </w:tcMar>
+            <w:tcBorders>
+              <w:top w:val="nil"/>
+              <w:left w:val="nil"/>
+              <w:bottom w:val="single" w:sz="4" w:space="0" w:color="4F81BD"/>
+              <w:right w:val="nil"/>
+            </w:tcBorders>
+            <w:shd w:fill="DBE5F1" w:val="clear" w:color="auto"/>
           </w:tcPr>
           <w:p>
             <w:pPr>
@@ -11283,6 +11331,7 @@
               <w:rPr>
                 <w:rFonts w:ascii="Calibri" w:hAnsi="Calibri"/>
                 <w:b/>
+                <w:color w:val="365F91"/>
                 <w:sz w:val="22"/>
               </w:rPr>
               <w:t>Value</w:t>
@@ -11305,6 +11354,13 @@
               <w:start w:w="72" w:type="dxa"/>
               <w:end w:w="72" w:type="dxa"/>
             </w:tcMar>
+            <w:tcBorders>
+              <w:top w:val="nil"/>
+              <w:left w:val="nil"/>
+              <w:bottom w:val="single" w:sz="4" w:space="0" w:color="4F81BD"/>
+              <w:right w:val="nil"/>
+            </w:tcBorders>
+            <w:shd w:fill="DBE5F1" w:val="clear" w:color="auto"/>
           </w:tcPr>
           <w:p>
             <w:pPr>
@@ -11314,6 +11370,7 @@
               <w:rPr>
                 <w:rFonts w:ascii="Calibri" w:hAnsi="Calibri"/>
                 <w:b/>
+                <w:color w:val="365F91"/>
                 <w:sz w:val="22"/>
               </w:rPr>
               <w:t>Annotation</w:t>
@@ -11633,13 +11690,12 @@
     </w:p>
     <w:p>
       <w:pPr>
+        <w:pStyle w:val="Heading2"/>
         <w:spacing w:before="200" w:after="80" w:line="240" w:lineRule="auto"/>
       </w:pPr>
       <w:r>
         <w:rPr>
-          <w:rFonts w:ascii="Calibri" w:hAnsi="Calibri"/>
-          <w:b/>
-          <w:sz w:val="22"/>
+          <w:sz w:val="24"/>
         </w:rPr>
         <w:t>Required</w:t>
       </w:r>
@@ -11676,26 +11732,24 @@
     </w:p>
     <w:p>
       <w:pPr>
+        <w:pStyle w:val="Heading2"/>
         <w:spacing w:before="200" w:after="80" w:line="240" w:lineRule="auto"/>
       </w:pPr>
       <w:r>
         <w:rPr>
-          <w:rFonts w:ascii="Calibri" w:hAnsi="Calibri"/>
-          <w:b/>
-          <w:sz w:val="22"/>
+          <w:sz w:val="24"/>
         </w:rPr>
         <w:t>Solution</w:t>
       </w:r>
     </w:p>
     <w:p>
       <w:pPr>
+        <w:pStyle w:val="Heading3"/>
         <w:ind w:left="357"/>
         <w:spacing w:before="160" w:after="60" w:line="240" w:lineRule="auto"/>
       </w:pPr>
       <w:r>
         <w:rPr>
-          <w:rFonts w:ascii="Calibri" w:hAnsi="Calibri"/>
-          <w:b/>
           <w:sz w:val="22"/>
         </w:rPr>
         <w:t>(a) Finding acceleration</w:t>
@@ -12759,13 +12813,12 @@
     </w:p>
     <w:p>
       <w:pPr>
+        <w:pStyle w:val="Heading3"/>
         <w:ind w:left="357"/>
         <w:spacing w:before="160" w:after="60" w:line="240" w:lineRule="auto"/>
       </w:pPr>
       <w:r>
         <w:rPr>
-          <w:rFonts w:ascii="Calibri" w:hAnsi="Calibri"/>
-          <w:b/>
           <w:sz w:val="22"/>
         </w:rPr>
         <w:t>(b) Finding distance traveled</w:t>
@@ -13586,14 +13639,10 @@
     </w:p>
     <w:p>
       <w:pPr>
+        <w:pStyle w:val="Heading1"/>
         <w:spacing w:before="360" w:after="120" w:line="240" w:lineRule="auto"/>
       </w:pPr>
       <w:r>
-        <w:rPr>
-          <w:rFonts w:ascii="Calibri" w:hAnsi="Calibri"/>
-          <w:b/>
-          <w:sz w:val="28"/>
-        </w:rPr>
         <w:t>Summary of Final Answers</w:t>
       </w:r>
     </w:p>
@@ -13603,12 +13652,12 @@
         <w:jc w:val="left"/>
         <w:tblLook w:firstColumn="1" w:firstRow="1" w:lastColumn="0" w:lastRow="0" w:noHBand="0" w:noVBand="1" w:val="04A0"/>
         <w:tblBorders>
-          <w:top w:val="single" w:sz="4" w:space="0" w:color="000000"/>
-          <w:left w:val="single" w:sz="4" w:space="0" w:color="000000"/>
-          <w:bottom w:val="single" w:sz="4" w:space="0" w:color="000000"/>
-          <w:right w:val="single" w:sz="4" w:space="0" w:color="000000"/>
-          <w:insideH w:val="single" w:sz="4" w:space="0" w:color="000000"/>
-          <w:insideV w:val="single" w:sz="4" w:space="0" w:color="000000"/>
+          <w:top w:val="single" w:sz="4" w:space="0" w:color="4F81BD"/>
+          <w:left w:val="single" w:sz="4" w:space="0" w:color="4F81BD"/>
+          <w:bottom w:val="single" w:sz="4" w:space="0" w:color="4F81BD"/>
+          <w:right w:val="single" w:sz="4" w:space="0" w:color="4F81BD"/>
+          <w:insideH w:val="single" w:sz="4" w:space="0" w:color="4F81BD"/>
+          <w:insideV w:val="single" w:sz="4" w:space="0" w:color="4F81BD"/>
         </w:tblBorders>
         <w:tblInd w:w="720" w:type="dxa"/>
       </w:tblPr>
@@ -13621,6 +13670,7 @@
         <w:tc>
           <w:tcPr>
             <w:tcW w:type="dxa" w:w="3120"/>
+            <w:shd w:fill="4F81BD" w:val="clear" w:color="auto"/>
           </w:tcPr>
           <w:p>
             <w:pPr>
@@ -13630,6 +13680,7 @@
               <w:rPr>
                 <w:rFonts w:ascii="Calibri" w:hAnsi="Calibri"/>
                 <w:b/>
+                <w:color w:val="FFFFFF"/>
                 <w:sz w:val="22"/>
               </w:rPr>
               <w:t>Problem</w:t>
@@ -13639,6 +13690,7 @@
         <w:tc>
           <w:tcPr>
             <w:tcW w:type="dxa" w:w="3120"/>
+            <w:shd w:fill="4F81BD" w:val="clear" w:color="auto"/>
           </w:tcPr>
           <w:p>
             <w:pPr>
@@ -13648,6 +13700,7 @@
               <w:rPr>
                 <w:rFonts w:ascii="Calibri" w:hAnsi="Calibri"/>
                 <w:b/>
+                <w:color w:val="FFFFFF"/>
                 <w:sz w:val="22"/>
               </w:rPr>
               <w:t>Part (a)</w:t>
@@ -13657,6 +13710,7 @@
         <w:tc>
           <w:tcPr>
             <w:tcW w:type="dxa" w:w="3120"/>
+            <w:shd w:fill="4F81BD" w:val="clear" w:color="auto"/>
           </w:tcPr>
           <w:p>
             <w:pPr>
@@ -13666,6 +13720,7 @@
               <w:rPr>
                 <w:rFonts w:ascii="Calibri" w:hAnsi="Calibri"/>
                 <w:b/>
+                <w:color w:val="FFFFFF"/>
                 <w:sz w:val="22"/>
               </w:rPr>
               <w:t>Part (b)</w:t>
@@ -13730,6 +13785,7 @@
         <w:tc>
           <w:tcPr>
             <w:tcW w:type="dxa" w:w="3120"/>
+            <w:shd w:fill="DBE5F1" w:val="clear" w:color="auto"/>
           </w:tcPr>
           <w:p>
             <w:pPr>
@@ -13747,6 +13803,7 @@
         <w:tc>
           <w:tcPr>
             <w:tcW w:type="dxa" w:w="3120"/>
+            <w:shd w:fill="DBE5F1" w:val="clear" w:color="auto"/>
           </w:tcPr>
           <w:p>
             <w:pPr>
@@ -13764,6 +13821,7 @@
         <w:tc>
           <w:tcPr>
             <w:tcW w:type="dxa" w:w="3120"/>
+            <w:shd w:fill="DBE5F1" w:val="clear" w:color="auto"/>
           </w:tcPr>
           <w:p>
             <w:pPr>
@@ -13836,6 +13894,7 @@
         <w:tc>
           <w:tcPr>
             <w:tcW w:type="dxa" w:w="3120"/>
+            <w:shd w:fill="DBE5F1" w:val="clear" w:color="auto"/>
           </w:tcPr>
           <w:p>
             <w:pPr>
@@ -13853,6 +13912,7 @@
         <w:tc>
           <w:tcPr>
             <w:tcW w:type="dxa" w:w="3120"/>
+            <w:shd w:fill="DBE5F1" w:val="clear" w:color="auto"/>
           </w:tcPr>
           <w:p>
             <w:pPr>
@@ -13870,6 +13930,7 @@
         <w:tc>
           <w:tcPr>
             <w:tcW w:type="dxa" w:w="3120"/>
+            <w:shd w:fill="DBE5F1" w:val="clear" w:color="auto"/>
           </w:tcPr>
           <w:p>
             <w:pPr>

</xml_diff>